<commit_message>
add: refresh the manual and presentation (android only, with screenshots)
</commit_message>
<xml_diff>
--- a/docs/manual/Manual-de-Usuario.docx
+++ b/docs/manual/Manual-de-Usuario.docx
@@ -94,7 +94,7 @@
           <w:color w:val="5C6650"/>
           <w:sz w:val="22"/>
         </w:rPr>
-        <w:t>PC (Windows / Linux)  ·  Android</w:t>
+        <w:t>Android (APK) · móvil táctil</w:t>
       </w:r>
     </w:p>
     <w:p>
@@ -490,7 +490,7 @@
           <w:color w:val="1B210F"/>
           <w:sz w:val="22"/>
         </w:rPr>
-        <w:t>Controles de teclado y ratón en PC, y controles táctiles en Android (doble joystick virtual).</w:t>
+        <w:t>Controles táctiles en Android (doble joystick virtual y botones en pantalla).</w:t>
       </w:r>
     </w:p>
     <w:p>
@@ -569,7 +569,7 @@
           <w:color w:val="1B210F"/>
           <w:sz w:val="22"/>
         </w:rPr>
-        <w:t>Software ligero y multiplataforma (Windows, Linux y Android).</w:t>
+        <w:t>Software ligero, pensado para Android (APK).</w:t>
       </w:r>
     </w:p>
     <w:p>
@@ -600,146 +600,6 @@
           <w:sz w:val="34"/>
         </w:rPr>
         <w:t>02  Requisitos del sistema</w:t>
-      </w:r>
-    </w:p>
-    <w:p>
-      <w:pPr>
-        <w:spacing w:before="200" w:after="60"/>
-      </w:pPr>
-      <w:r>
-        <w:rPr>
-          <w:b/>
-          <w:i w:val="0"/>
-          <w:color w:val="1B210F"/>
-          <w:sz w:val="25"/>
-        </w:rPr>
-        <w:t>PC (Windows / Linux)</w:t>
-      </w:r>
-    </w:p>
-    <w:p>
-      <w:pPr>
-        <w:pStyle w:val="ListBullet"/>
-        <w:spacing w:after="40"/>
-      </w:pPr>
-      <w:r>
-        <w:rPr>
-          <w:b/>
-          <w:color w:val="3F6B25"/>
-          <w:sz w:val="22"/>
-        </w:rPr>
-        <w:t xml:space="preserve">Sistema operativo: </w:t>
-      </w:r>
-      <w:r>
-        <w:rPr>
-          <w:color w:val="1B210F"/>
-          <w:sz w:val="22"/>
-        </w:rPr>
-        <w:t>Windows 10/11 de 64 bits o Linux (probado en Arch Linux).</w:t>
-      </w:r>
-    </w:p>
-    <w:p>
-      <w:pPr>
-        <w:pStyle w:val="ListBullet"/>
-        <w:spacing w:after="40"/>
-      </w:pPr>
-      <w:r>
-        <w:rPr>
-          <w:b/>
-          <w:color w:val="3F6B25"/>
-          <w:sz w:val="22"/>
-        </w:rPr>
-        <w:t xml:space="preserve">Procesador: </w:t>
-      </w:r>
-      <w:r>
-        <w:rPr>
-          <w:color w:val="1B210F"/>
-          <w:sz w:val="22"/>
-        </w:rPr>
-        <w:t>Intel Core i3 o equivalente (x86-64).</w:t>
-      </w:r>
-    </w:p>
-    <w:p>
-      <w:pPr>
-        <w:pStyle w:val="ListBullet"/>
-        <w:spacing w:after="40"/>
-      </w:pPr>
-      <w:r>
-        <w:rPr>
-          <w:b/>
-          <w:color w:val="3F6B25"/>
-          <w:sz w:val="22"/>
-        </w:rPr>
-        <w:t xml:space="preserve">Memoria RAM: </w:t>
-      </w:r>
-      <w:r>
-        <w:rPr>
-          <w:color w:val="1B210F"/>
-          <w:sz w:val="22"/>
-        </w:rPr>
-        <w:t>2 GB (4 GB recomendados).</w:t>
-      </w:r>
-    </w:p>
-    <w:p>
-      <w:pPr>
-        <w:pStyle w:val="ListBullet"/>
-        <w:spacing w:after="40"/>
-      </w:pPr>
-      <w:r>
-        <w:rPr>
-          <w:b/>
-          <w:color w:val="3F6B25"/>
-          <w:sz w:val="22"/>
-        </w:rPr>
-        <w:t xml:space="preserve">Almacenamiento: </w:t>
-      </w:r>
-      <w:r>
-        <w:rPr>
-          <w:color w:val="1B210F"/>
-          <w:sz w:val="22"/>
-        </w:rPr>
-        <w:t>300 MB libres.</w:t>
-      </w:r>
-    </w:p>
-    <w:p>
-      <w:pPr>
-        <w:pStyle w:val="ListBullet"/>
-        <w:spacing w:after="40"/>
-      </w:pPr>
-      <w:r>
-        <w:rPr>
-          <w:b/>
-          <w:color w:val="3F6B25"/>
-          <w:sz w:val="22"/>
-        </w:rPr>
-        <w:t xml:space="preserve">Gráficos: </w:t>
-      </w:r>
-      <w:r>
-        <w:rPr>
-          <w:color w:val="1B210F"/>
-          <w:sz w:val="22"/>
-        </w:rPr>
-        <w:t>GPU compatible con Vulkan (renderizador Forward+).</w:t>
-      </w:r>
-    </w:p>
-    <w:p>
-      <w:pPr>
-        <w:pStyle w:val="ListBullet"/>
-        <w:spacing w:after="40"/>
-      </w:pPr>
-      <w:r>
-        <w:rPr>
-          <w:b/>
-          <w:color w:val="3F6B25"/>
-          <w:sz w:val="22"/>
-        </w:rPr>
-        <w:t xml:space="preserve">Resolución: </w:t>
-      </w:r>
-      <w:r>
-        <w:rPr>
-          <w:color w:val="1B210F"/>
-          <w:sz w:val="22"/>
-        </w:rPr>
-        <w:t>1920×1080 recomendada; el juego se adapta a otras resoluciones.</w:t>
       </w:r>
     </w:p>
     <w:p>
@@ -840,59 +700,6 @@
           <w:color w:val="1B210F"/>
           <w:sz w:val="25"/>
         </w:rPr>
-        <w:t>Instalación en PC</w:t>
-      </w:r>
-    </w:p>
-    <w:p>
-      <w:pPr>
-        <w:pStyle w:val="ListBullet"/>
-        <w:spacing w:after="40"/>
-      </w:pPr>
-      <w:r>
-        <w:rPr>
-          <w:color w:val="1B210F"/>
-          <w:sz w:val="22"/>
-        </w:rPr>
-        <w:t>Descarga el juego desde el repositorio oficial (GitHub: github.com/l1teSG/dirty-road-godot) o desde el enlace del proyecto.</w:t>
-      </w:r>
-    </w:p>
-    <w:p>
-      <w:pPr>
-        <w:pStyle w:val="ListBullet"/>
-        <w:spacing w:after="40"/>
-      </w:pPr>
-      <w:r>
-        <w:rPr>
-          <w:color w:val="1B210F"/>
-          <w:sz w:val="22"/>
-        </w:rPr>
-        <w:t>Descomprime la carpeta en el lugar que prefieras.</w:t>
-      </w:r>
-    </w:p>
-    <w:p>
-      <w:pPr>
-        <w:pStyle w:val="ListBullet"/>
-        <w:spacing w:after="40"/>
-      </w:pPr>
-      <w:r>
-        <w:rPr>
-          <w:color w:val="1B210F"/>
-          <w:sz w:val="22"/>
-        </w:rPr>
-        <w:t>Ejecuta el archivo del juego. No requiere instalador ni permisos de administrador.</w:t>
-      </w:r>
-    </w:p>
-    <w:p>
-      <w:pPr>
-        <w:spacing w:before="200" w:after="60"/>
-      </w:pPr>
-      <w:r>
-        <w:rPr>
-          <w:b/>
-          <w:i w:val="0"/>
-          <w:color w:val="1B210F"/>
-          <w:sz w:val="25"/>
-        </w:rPr>
         <w:t>Instalación en Android (APK)</w:t>
       </w:r>
     </w:p>
@@ -961,6 +768,57 @@
           <w:sz w:val="22"/>
         </w:rPr>
         <w:t>Al abrir el juego aparece la pantalla de título (DIRTY ROAD · «SALVA EL BOSQUE»). Pulsa JUGAR para comenzar o PARTIDAS para continuar una partida guardada.</w:t>
+      </w:r>
+    </w:p>
+    <w:p>
+      <w:pPr>
+        <w:jc w:val="center"/>
+      </w:pPr>
+      <w:r>
+        <w:drawing>
+          <wp:inline xmlns:a="http://schemas.openxmlformats.org/drawingml/2006/main" xmlns:pic="http://schemas.openxmlformats.org/drawingml/2006/picture">
+            <wp:extent cx="5486400" cy="3086100"/>
+            <wp:docPr id="1" name="Picture 1"/>
+            <wp:cNvGraphicFramePr>
+              <a:graphicFrameLocks noChangeAspect="1"/>
+            </wp:cNvGraphicFramePr>
+            <a:graphic>
+              <a:graphicData uri="http://schemas.openxmlformats.org/drawingml/2006/picture">
+                <pic:pic>
+                  <pic:nvPicPr>
+                    <pic:cNvPr id="0" name="intro.png"/>
+                    <pic:cNvPicPr/>
+                  </pic:nvPicPr>
+                  <pic:blipFill>
+                    <a:blip r:embed="rId9"/>
+                    <a:stretch>
+                      <a:fillRect/>
+                    </a:stretch>
+                  </pic:blipFill>
+                  <pic:spPr>
+                    <a:xfrm>
+                      <a:off x="0" y="0"/>
+                      <a:ext cx="5486400" cy="3086100"/>
+                    </a:xfrm>
+                    <a:prstGeom prst="rect"/>
+                  </pic:spPr>
+                </pic:pic>
+              </a:graphicData>
+            </a:graphic>
+          </wp:inline>
+        </w:drawing>
+      </w:r>
+    </w:p>
+    <w:p>
+      <w:pPr>
+        <w:jc w:val="center"/>
+      </w:pPr>
+      <w:r>
+        <w:rPr>
+          <w:i/>
+          <w:sz w:val="36"/>
+        </w:rPr>
+        <w:t>Pantalla de título («SALVA EL BOSQUE»).</w:t>
       </w:r>
     </w:p>
     <w:p>
@@ -1159,6 +1017,57 @@
     </w:p>
     <w:p>
       <w:pPr>
+        <w:jc w:val="center"/>
+      </w:pPr>
+      <w:r>
+        <w:drawing>
+          <wp:inline xmlns:a="http://schemas.openxmlformats.org/drawingml/2006/main" xmlns:pic="http://schemas.openxmlformats.org/drawingml/2006/picture">
+            <wp:extent cx="5669280" cy="3188970"/>
+            <wp:docPr id="5" name="Picture 5"/>
+            <wp:cNvGraphicFramePr>
+              <a:graphicFrameLocks noChangeAspect="1"/>
+            </wp:cNvGraphicFramePr>
+            <a:graphic>
+              <a:graphicData uri="http://schemas.openxmlformats.org/drawingml/2006/picture">
+                <pic:pic>
+                  <pic:nvPicPr>
+                    <pic:cNvPr id="0" name="jefe.png"/>
+                    <pic:cNvPicPr/>
+                  </pic:nvPicPr>
+                  <pic:blipFill>
+                    <a:blip r:embed="rId13"/>
+                    <a:stretch>
+                      <a:fillRect/>
+                    </a:stretch>
+                  </pic:blipFill>
+                  <pic:spPr>
+                    <a:xfrm>
+                      <a:off x="0" y="0"/>
+                      <a:ext cx="5669280" cy="3188970"/>
+                    </a:xfrm>
+                    <a:prstGeom prst="rect"/>
+                  </pic:spPr>
+                </pic:pic>
+              </a:graphicData>
+            </a:graphic>
+          </wp:inline>
+        </w:drawing>
+      </w:r>
+    </w:p>
+    <w:p>
+      <w:pPr>
+        <w:jc w:val="center"/>
+      </w:pPr>
+      <w:r>
+        <w:rPr>
+          <w:i/>
+          <w:sz w:val="36"/>
+        </w:rPr>
+        <w:t>Oleada de jefe: barra de vida del jefe.</w:t>
+      </w:r>
+    </w:p>
+    <w:p>
+      <w:pPr>
         <w:pStyle w:val="ListBullet"/>
         <w:spacing w:after="40"/>
       </w:pPr>
@@ -1182,6 +1091,57 @@
           <w:sz w:val="22"/>
         </w:rPr>
         <w:t>Todo el HUD es escalable y su opacidad se puede ajustar.</w:t>
+      </w:r>
+    </w:p>
+    <w:p>
+      <w:pPr>
+        <w:jc w:val="center"/>
+      </w:pPr>
+      <w:r>
+        <w:drawing>
+          <wp:inline xmlns:a="http://schemas.openxmlformats.org/drawingml/2006/main" xmlns:pic="http://schemas.openxmlformats.org/drawingml/2006/picture">
+            <wp:extent cx="5669280" cy="3188970"/>
+            <wp:docPr id="2" name="Picture 2"/>
+            <wp:cNvGraphicFramePr>
+              <a:graphicFrameLocks noChangeAspect="1"/>
+            </wp:cNvGraphicFramePr>
+            <a:graphic>
+              <a:graphicData uri="http://schemas.openxmlformats.org/drawingml/2006/picture">
+                <pic:pic>
+                  <pic:nvPicPr>
+                    <pic:cNvPr id="0" name="hud.png"/>
+                    <pic:cNvPicPr/>
+                  </pic:nvPicPr>
+                  <pic:blipFill>
+                    <a:blip r:embed="rId10"/>
+                    <a:stretch>
+                      <a:fillRect/>
+                    </a:stretch>
+                  </pic:blipFill>
+                  <pic:spPr>
+                    <a:xfrm>
+                      <a:off x="0" y="0"/>
+                      <a:ext cx="5669280" cy="3188970"/>
+                    </a:xfrm>
+                    <a:prstGeom prst="rect"/>
+                  </pic:spPr>
+                </pic:pic>
+              </a:graphicData>
+            </a:graphic>
+          </wp:inline>
+        </w:drawing>
+      </w:r>
+    </w:p>
+    <w:p>
+      <w:pPr>
+        <w:jc w:val="center"/>
+      </w:pPr>
+      <w:r>
+        <w:rPr>
+          <w:i/>
+          <w:sz w:val="36"/>
+        </w:rPr>
+        <w:t>Partida en curso: HUD, enemigos y ficha educativa.</w:t>
       </w:r>
     </w:p>
     <w:p>
@@ -1423,6 +1383,57 @@
     </w:p>
     <w:p>
       <w:pPr>
+        <w:jc w:val="center"/>
+      </w:pPr>
+      <w:r>
+        <w:drawing>
+          <wp:inline xmlns:a="http://schemas.openxmlformats.org/drawingml/2006/main" xmlns:pic="http://schemas.openxmlformats.org/drawingml/2006/picture">
+            <wp:extent cx="5669280" cy="3188970"/>
+            <wp:docPr id="3" name="Picture 3"/>
+            <wp:cNvGraphicFramePr>
+              <a:graphicFrameLocks noChangeAspect="1"/>
+            </wp:cNvGraphicFramePr>
+            <a:graphic>
+              <a:graphicData uri="http://schemas.openxmlformats.org/drawingml/2006/picture">
+                <pic:pic>
+                  <pic:nvPicPr>
+                    <pic:cNvPr id="0" name="cartas.png"/>
+                    <pic:cNvPicPr/>
+                  </pic:nvPicPr>
+                  <pic:blipFill>
+                    <a:blip r:embed="rId11"/>
+                    <a:stretch>
+                      <a:fillRect/>
+                    </a:stretch>
+                  </pic:blipFill>
+                  <pic:spPr>
+                    <a:xfrm>
+                      <a:off x="0" y="0"/>
+                      <a:ext cx="5669280" cy="3188970"/>
+                    </a:xfrm>
+                    <a:prstGeom prst="rect"/>
+                  </pic:spPr>
+                </pic:pic>
+              </a:graphicData>
+            </a:graphic>
+          </wp:inline>
+        </w:drawing>
+      </w:r>
+    </w:p>
+    <w:p>
+      <w:pPr>
+        <w:jc w:val="center"/>
+      </w:pPr>
+      <w:r>
+        <w:rPr>
+          <w:i/>
+          <w:sz w:val="36"/>
+        </w:rPr>
+        <w:t>Cartas de mejora ofrecidas entre oleadas.</w:t>
+      </w:r>
+    </w:p>
+    <w:p>
+      <w:pPr>
         <w:spacing w:before="320" w:after="80"/>
         <w:pBdr>
           <w:bottom w:val="single" w:sz="8" w:space="4" w:color="8EC74A"/>
@@ -1449,125 +1460,6 @@
           <w:color w:val="1B210F"/>
           <w:sz w:val="25"/>
         </w:rPr>
-        <w:t>PC (teclado y ratón)</w:t>
-      </w:r>
-    </w:p>
-    <w:p>
-      <w:pPr>
-        <w:pStyle w:val="ListBullet"/>
-        <w:spacing w:after="40"/>
-      </w:pPr>
-      <w:r>
-        <w:rPr>
-          <w:b/>
-          <w:color w:val="3F6B25"/>
-          <w:sz w:val="22"/>
-        </w:rPr>
-        <w:t xml:space="preserve">Moverse: </w:t>
-      </w:r>
-      <w:r>
-        <w:rPr>
-          <w:color w:val="1B210F"/>
-          <w:sz w:val="22"/>
-        </w:rPr>
-        <w:t>flechas del teclado.</w:t>
-      </w:r>
-    </w:p>
-    <w:p>
-      <w:pPr>
-        <w:pStyle w:val="ListBullet"/>
-        <w:spacing w:after="40"/>
-      </w:pPr>
-      <w:r>
-        <w:rPr>
-          <w:b/>
-          <w:color w:val="3F6B25"/>
-          <w:sz w:val="22"/>
-        </w:rPr>
-        <w:t xml:space="preserve">Atacar: </w:t>
-      </w:r>
-      <w:r>
-        <w:rPr>
-          <w:color w:val="1B210F"/>
-          <w:sz w:val="22"/>
-        </w:rPr>
-        <w:t>automático (apunta al enemigo más cercano) o manual.</w:t>
-      </w:r>
-    </w:p>
-    <w:p>
-      <w:pPr>
-        <w:pStyle w:val="ListBullet"/>
-        <w:spacing w:after="40"/>
-      </w:pPr>
-      <w:r>
-        <w:rPr>
-          <w:b/>
-          <w:color w:val="3F6B25"/>
-          <w:sz w:val="22"/>
-        </w:rPr>
-        <w:t xml:space="preserve">Súper (lluvia de meteoritos): </w:t>
-      </w:r>
-      <w:r>
-        <w:rPr>
-          <w:color w:val="1B210F"/>
-          <w:sz w:val="22"/>
-        </w:rPr>
-        <w:t>clic izquierdo del ratón (consume biomasa).</w:t>
-      </w:r>
-    </w:p>
-    <w:p>
-      <w:pPr>
-        <w:pStyle w:val="ListBullet"/>
-        <w:spacing w:after="40"/>
-      </w:pPr>
-      <w:r>
-        <w:rPr>
-          <w:b/>
-          <w:color w:val="3F6B25"/>
-          <w:sz w:val="22"/>
-        </w:rPr>
-        <w:t xml:space="preserve">Dash (esquivar con invulnerabilidad): </w:t>
-      </w:r>
-      <w:r>
-        <w:rPr>
-          <w:color w:val="1B210F"/>
-          <w:sz w:val="22"/>
-        </w:rPr>
-        <w:t>clic derecho del ratón.</w:t>
-      </w:r>
-    </w:p>
-    <w:p>
-      <w:pPr>
-        <w:pStyle w:val="ListBullet"/>
-        <w:spacing w:after="40"/>
-      </w:pPr>
-      <w:r>
-        <w:rPr>
-          <w:b/>
-          <w:color w:val="3F6B25"/>
-          <w:sz w:val="22"/>
-        </w:rPr>
-        <w:t xml:space="preserve">Menú de depuración (builds de prueba): </w:t>
-      </w:r>
-      <w:r>
-        <w:rPr>
-          <w:color w:val="1B210F"/>
-          <w:sz w:val="22"/>
-        </w:rPr>
-        <w:t>F1.</w:t>
-      </w:r>
-    </w:p>
-    <w:p>
-      <w:pPr>
-        <w:spacing w:before="200" w:after="60"/>
-      </w:pPr>
-      <w:r>
-        <w:rPr>
-          <w:b/>
-          <w:i w:val="0"/>
-          <w:color w:val="1B210F"/>
-          <w:sz w:val="25"/>
-        </w:rPr>
         <w:t>Android (táctil)</w:t>
       </w:r>
     </w:p>
@@ -1776,6 +1668,57 @@
     </w:p>
     <w:p>
       <w:pPr>
+        <w:jc w:val="center"/>
+      </w:pPr>
+      <w:r>
+        <w:drawing>
+          <wp:inline xmlns:a="http://schemas.openxmlformats.org/drawingml/2006/main" xmlns:pic="http://schemas.openxmlformats.org/drawingml/2006/picture">
+            <wp:extent cx="5669280" cy="3188970"/>
+            <wp:docPr id="4" name="Picture 4"/>
+            <wp:cNvGraphicFramePr>
+              <a:graphicFrameLocks noChangeAspect="1"/>
+            </wp:cNvGraphicFramePr>
+            <a:graphic>
+              <a:graphicData uri="http://schemas.openxmlformats.org/drawingml/2006/picture">
+                <pic:pic>
+                  <pic:nvPicPr>
+                    <pic:cNvPr id="0" name="ajustes.png"/>
+                    <pic:cNvPicPr/>
+                  </pic:nvPicPr>
+                  <pic:blipFill>
+                    <a:blip r:embed="rId12"/>
+                    <a:stretch>
+                      <a:fillRect/>
+                    </a:stretch>
+                  </pic:blipFill>
+                  <pic:spPr>
+                    <a:xfrm>
+                      <a:off x="0" y="0"/>
+                      <a:ext cx="5669280" cy="3188970"/>
+                    </a:xfrm>
+                    <a:prstGeom prst="rect"/>
+                  </pic:spPr>
+                </pic:pic>
+              </a:graphicData>
+            </a:graphic>
+          </wp:inline>
+        </w:drawing>
+      </w:r>
+    </w:p>
+    <w:p>
+      <w:pPr>
+        <w:jc w:val="center"/>
+      </w:pPr>
+      <w:r>
+        <w:rPr>
+          <w:i/>
+          <w:sz w:val="36"/>
+        </w:rPr>
+        <w:t>Menú de ajustes, por pestañas.</w:t>
+      </w:r>
+    </w:p>
+    <w:p>
+      <w:pPr>
         <w:spacing w:before="320" w:after="80"/>
         <w:pBdr>
           <w:bottom w:val="single" w:sz="8" w:space="4" w:color="8EC74A"/>
@@ -1802,14 +1745,13 @@
           <w:color w:val="3F6B25"/>
           <w:sz w:val="22"/>
         </w:rPr>
-        <w:t xml:space="preserve">El juego no abre en Windows: </w:t>
+        <w:t>El juego no abre en Android: comprueba que el dispositivo tiene Android 8.0 o superior y vuelve a instalar el APK.</w:t>
       </w:r>
       <w:r>
         <w:rPr>
           <w:color w:val="1B210F"/>
           <w:sz w:val="22"/>
         </w:rPr>
-        <w:t>verifica que sea Windows 10/11 de 64 bits y que la GPU soporte Vulkan; actualiza los controladores.</w:t>
       </w:r>
     </w:p>
     <w:p>

</xml_diff>